<commit_message>
Text Box Definition Changes
</commit_message>
<xml_diff>
--- a/PRDs/SnapMock-Text-Callout-Annotation-Tools-PRD.docx
+++ b/PRDs/SnapMock-Text-Callout-Annotation-Tools-PRD.docx
@@ -95,7 +95,7 @@
           <w:sz w:val="24"/>
           <w:szCs w:val="24"/>
         </w:rPr>
-        <w:t xml:space="preserve">Version 1.2</w:t>
+        <w:t xml:space="preserve">Version 1.3</w:t>
       </w:r>
     </w:p>
     <w:p>
@@ -241,7 +241,7 @@
         <w:spacing w:after="120"/>
       </w:pPr>
       <w:r>
-        <w:t xml:space="preserve">   3.4 Auto-Size Behavior</w:t>
+        <w:t xml:space="preserve">   3.4 Auto-Size and Resize Behavior</w:t>
       </w:r>
     </w:p>
     <w:p>
@@ -2895,7 +2895,7 @@
         <w:spacing w:after="60"/>
       </w:pPr>
       <w:r>
-        <w:t xml:space="preserve">If auto_height is disabled (fixed-size mode), text that exceeds the box height is clipped at the bottom edge with a visual indicator (a subtle gradient fade or "..." ellipsis at the clip boundary).</w:t>
+        <w:t xml:space="preserve">If auto_height is disabled (fixed-size mode) and text exceeds the box height, the text overflows outside the box boundary but remains fully visible. Text is never clipped or hidden.</w:t>
       </w:r>
     </w:p>
     <w:p>
@@ -2959,7 +2959,7 @@
         <w:spacing w:after="60"/>
       </w:pPr>
       <w:r>
-        <w:t xml:space="preserve">Set the QPainter clip region to the text area (inset by padding from the shape boundary).</w:t>
+        <w:t xml:space="preserve">If in edit mode, set the QPainter clip region to the text area (inset by padding from the shape boundary). If not in edit mode, do not clip — text that overflows the boundary renders visibly outside the box.</w:t>
       </w:r>
     </w:p>
     <w:p>
@@ -2973,19 +2973,6 @@
       </w:pPr>
       <w:r>
         <w:t xml:space="preserve">Call QTextDocument.drawContents(painter, text_area_rect) to render the formatted text.</w:t>
-      </w:r>
-    </w:p>
-    <w:p>
-      <w:pPr>
-        <w:pStyle w:val="ListParagraph"/>
-        <w:numPr>
-          <w:ilvl w:val="0"/>
-          <w:numId w:val="6"/>
-        </w:numPr>
-        <w:spacing w:after="60"/>
-      </w:pPr>
-      <w:r>
-        <w:t xml:space="preserve">If text is clipped (overflow), draw the overflow indicator.</w:t>
       </w:r>
     </w:p>
     <w:p>
@@ -5569,7 +5556,7 @@
         <w:spacing w:after="60"/>
       </w:pPr>
       <w:r>
-        <w:t xml:space="preserve">A new TextItem is created at the click position with a default width of 200px and auto_height enabled.</w:t>
+        <w:t xml:space="preserve">A new TextItem is created at the click position with a minimum width of 200px. Both auto_width and auto_height are enabled.</w:t>
       </w:r>
     </w:p>
     <w:p>
@@ -5595,7 +5582,7 @@
         <w:spacing w:after="60"/>
       </w:pPr>
       <w:r>
-        <w:t xml:space="preserve">The user begins typing. The box width is fixed at 200px; height grows to accommodate content.</w:t>
+        <w:t xml:space="preserve">The user begins typing. The box auto-sizes in both width and height to fit the text content. The width never shrinks below the 200px minimum. See Section 3.4.1.</w:t>
       </w:r>
     </w:p>
     <w:p>
@@ -5672,7 +5659,7 @@
         <w:spacing w:after="60"/>
       </w:pPr>
       <w:r>
-        <w:t xml:space="preserve">On release, a TextItem is created with the drawn dimensions. Width is fixed to the drawn width. Height behavior depends on auto_height setting.</w:t>
+        <w:t xml:space="preserve">On release, a TextItem is created. The drawn dimensions set the minimum width and minimum height for the text box. Both auto_width and auto_height are enabled. The box auto-sizes to fit text content but never shrinks below the drawn dimensions. See Section 3.4.1.</w:t>
       </w:r>
     </w:p>
     <w:p>
@@ -6181,7 +6168,7 @@
                 <w:sz w:val="20"/>
                 <w:szCs w:val="20"/>
               </w:rPr>
-              <w:t xml:space="preserve">False</w:t>
+              <w:t xml:space="preserve">True</w:t>
             </w:r>
           </w:p>
         </w:tc>
@@ -6208,7 +6195,7 @@
                 <w:sz w:val="20"/>
                 <w:szCs w:val="20"/>
               </w:rPr>
-              <w:t xml:space="preserve">When True, the box width automatically adjusts to fit the longest line (no word wrapping). When False, width is fixed and text wraps.</w:t>
+              <w:t xml:space="preserve">When True, the box width automatically adjusts to fit the longest line (no word wrapping). Always True during edit mode. When False (set by normal resize after editing), width is fixed and text wraps/reflows.</w:t>
             </w:r>
           </w:p>
         </w:tc>
@@ -7447,7 +7434,7 @@
                 <w:sz w:val="20"/>
                 <w:szCs w:val="20"/>
               </w:rPr>
-              <w:t xml:space="preserve">overflow_mode</w:t>
+              <w:t xml:space="preserve">text_scale_factor</w:t>
             </w:r>
           </w:p>
         </w:tc>
@@ -7474,7 +7461,7 @@
                 <w:sz w:val="20"/>
                 <w:szCs w:val="20"/>
               </w:rPr>
-              <w:t xml:space="preserve">enum</w:t>
+              <w:t xml:space="preserve">float</w:t>
             </w:r>
           </w:p>
         </w:tc>
@@ -7501,7 +7488,7 @@
                 <w:sz w:val="20"/>
                 <w:szCs w:val="20"/>
               </w:rPr>
-              <w:t xml:space="preserve">Grow</w:t>
+              <w:t xml:space="preserve">1.0</w:t>
             </w:r>
           </w:p>
         </w:tc>
@@ -7528,7 +7515,227 @@
                 <w:sz w:val="20"/>
                 <w:szCs w:val="20"/>
               </w:rPr>
-              <w:t xml:space="preserve">Grow: auto_height expands the box. Clip: text is clipped at the boundary. Ellipsis: clipped with … at the end.</w:t>
+              <w:t xml:space="preserve">Render-time scale factor applied to all text content. Modified only by Shift+resize. See Section 3.4.3.</w:t>
+            </w:r>
+          </w:p>
+        </w:tc>
+      </w:tr>
+      <w:tr>
+        <w:tc>
+          <w:tcPr>
+            <w:tcW w:type="dxa" w:w="1800"/>
+            <w:tcBorders>
+              <w:top w:val="single" w:color="CCCCCC" w:sz="1"/>
+              <w:left w:val="single" w:color="CCCCCC" w:sz="1"/>
+              <w:bottom w:val="single" w:color="CCCCCC" w:sz="1"/>
+              <w:right w:val="single" w:color="CCCCCC" w:sz="1"/>
+            </w:tcBorders>
+            <w:tcMar>
+              <w:top w:type="dxa" w:w="80"/>
+              <w:left w:type="dxa" w:w="120"/>
+              <w:bottom w:type="dxa" w:w="80"/>
+              <w:right w:type="dxa" w:w="120"/>
+            </w:tcMar>
+          </w:tcPr>
+          <w:p>
+            <w:r>
+              <w:rPr>
+                <w:rFonts w:ascii="Arial" w:cs="Arial" w:eastAsia="Arial" w:hAnsi="Arial"/>
+                <w:sz w:val="20"/>
+                <w:szCs w:val="20"/>
+              </w:rPr>
+              <w:t xml:space="preserve">min_width</w:t>
+            </w:r>
+          </w:p>
+        </w:tc>
+        <w:tc>
+          <w:tcPr>
+            <w:tcW w:type="dxa" w:w="1600"/>
+            <w:tcBorders>
+              <w:top w:val="single" w:color="CCCCCC" w:sz="1"/>
+              <w:left w:val="single" w:color="CCCCCC" w:sz="1"/>
+              <w:bottom w:val="single" w:color="CCCCCC" w:sz="1"/>
+              <w:right w:val="single" w:color="CCCCCC" w:sz="1"/>
+            </w:tcBorders>
+            <w:tcMar>
+              <w:top w:type="dxa" w:w="80"/>
+              <w:left w:type="dxa" w:w="120"/>
+              <w:bottom w:type="dxa" w:w="80"/>
+              <w:right w:type="dxa" w:w="120"/>
+            </w:tcMar>
+          </w:tcPr>
+          <w:p>
+            <w:r>
+              <w:rPr>
+                <w:rFonts w:ascii="Arial" w:cs="Arial" w:eastAsia="Arial" w:hAnsi="Arial"/>
+                <w:sz w:val="20"/>
+                <w:szCs w:val="20"/>
+              </w:rPr>
+              <w:t xml:space="preserve">float</w:t>
+            </w:r>
+          </w:p>
+        </w:tc>
+        <w:tc>
+          <w:tcPr>
+            <w:tcW w:type="dxa" w:w="1400"/>
+            <w:tcBorders>
+              <w:top w:val="single" w:color="CCCCCC" w:sz="1"/>
+              <w:left w:val="single" w:color="CCCCCC" w:sz="1"/>
+              <w:bottom w:val="single" w:color="CCCCCC" w:sz="1"/>
+              <w:right w:val="single" w:color="CCCCCC" w:sz="1"/>
+            </w:tcBorders>
+            <w:tcMar>
+              <w:top w:type="dxa" w:w="80"/>
+              <w:left w:type="dxa" w:w="120"/>
+              <w:bottom w:type="dxa" w:w="80"/>
+              <w:right w:type="dxa" w:w="120"/>
+            </w:tcMar>
+          </w:tcPr>
+          <w:p>
+            <w:r>
+              <w:rPr>
+                <w:rFonts w:ascii="Arial" w:cs="Arial" w:eastAsia="Arial" w:hAnsi="Arial"/>
+                <w:sz w:val="20"/>
+                <w:szCs w:val="20"/>
+              </w:rPr>
+              <w:t xml:space="preserve">200.0</w:t>
+            </w:r>
+          </w:p>
+        </w:tc>
+        <w:tc>
+          <w:tcPr>
+            <w:tcW w:type="dxa" w:w="4560"/>
+            <w:tcBorders>
+              <w:top w:val="single" w:color="CCCCCC" w:sz="1"/>
+              <w:left w:val="single" w:color="CCCCCC" w:sz="1"/>
+              <w:bottom w:val="single" w:color="CCCCCC" w:sz="1"/>
+              <w:right w:val="single" w:color="CCCCCC" w:sz="1"/>
+            </w:tcBorders>
+            <w:tcMar>
+              <w:top w:type="dxa" w:w="80"/>
+              <w:left w:type="dxa" w:w="120"/>
+              <w:bottom w:type="dxa" w:w="80"/>
+              <w:right w:type="dxa" w:w="120"/>
+            </w:tcMar>
+          </w:tcPr>
+          <w:p>
+            <w:r>
+              <w:rPr>
+                <w:rFonts w:ascii="Arial" w:cs="Arial" w:eastAsia="Arial" w:hAnsi="Arial"/>
+                <w:sz w:val="20"/>
+                <w:szCs w:val="20"/>
+              </w:rPr>
+              <w:t xml:space="preserve">Minimum box width in pixels. Set to 200px for click-to-create, or the drawn width for drag-to-create.</w:t>
+            </w:r>
+          </w:p>
+        </w:tc>
+      </w:tr>
+      <w:tr>
+        <w:tc>
+          <w:tcPr>
+            <w:tcW w:type="dxa" w:w="1800"/>
+            <w:tcBorders>
+              <w:top w:val="single" w:color="CCCCCC" w:sz="1"/>
+              <w:left w:val="single" w:color="CCCCCC" w:sz="1"/>
+              <w:bottom w:val="single" w:color="CCCCCC" w:sz="1"/>
+              <w:right w:val="single" w:color="CCCCCC" w:sz="1"/>
+            </w:tcBorders>
+            <w:tcMar>
+              <w:top w:type="dxa" w:w="80"/>
+              <w:left w:type="dxa" w:w="120"/>
+              <w:bottom w:type="dxa" w:w="80"/>
+              <w:right w:type="dxa" w:w="120"/>
+            </w:tcMar>
+          </w:tcPr>
+          <w:p>
+            <w:r>
+              <w:rPr>
+                <w:rFonts w:ascii="Arial" w:cs="Arial" w:eastAsia="Arial" w:hAnsi="Arial"/>
+                <w:sz w:val="20"/>
+                <w:szCs w:val="20"/>
+              </w:rPr>
+              <w:t xml:space="preserve">min_height</w:t>
+            </w:r>
+          </w:p>
+        </w:tc>
+        <w:tc>
+          <w:tcPr>
+            <w:tcW w:type="dxa" w:w="1600"/>
+            <w:tcBorders>
+              <w:top w:val="single" w:color="CCCCCC" w:sz="1"/>
+              <w:left w:val="single" w:color="CCCCCC" w:sz="1"/>
+              <w:bottom w:val="single" w:color="CCCCCC" w:sz="1"/>
+              <w:right w:val="single" w:color="CCCCCC" w:sz="1"/>
+            </w:tcBorders>
+            <w:tcMar>
+              <w:top w:type="dxa" w:w="80"/>
+              <w:left w:type="dxa" w:w="120"/>
+              <w:bottom w:type="dxa" w:w="80"/>
+              <w:right w:type="dxa" w:w="120"/>
+            </w:tcMar>
+          </w:tcPr>
+          <w:p>
+            <w:r>
+              <w:rPr>
+                <w:rFonts w:ascii="Arial" w:cs="Arial" w:eastAsia="Arial" w:hAnsi="Arial"/>
+                <w:sz w:val="20"/>
+                <w:szCs w:val="20"/>
+              </w:rPr>
+              <w:t xml:space="preserve">float</w:t>
+            </w:r>
+          </w:p>
+        </w:tc>
+        <w:tc>
+          <w:tcPr>
+            <w:tcW w:type="dxa" w:w="1400"/>
+            <w:tcBorders>
+              <w:top w:val="single" w:color="CCCCCC" w:sz="1"/>
+              <w:left w:val="single" w:color="CCCCCC" w:sz="1"/>
+              <w:bottom w:val="single" w:color="CCCCCC" w:sz="1"/>
+              <w:right w:val="single" w:color="CCCCCC" w:sz="1"/>
+            </w:tcBorders>
+            <w:tcMar>
+              <w:top w:type="dxa" w:w="80"/>
+              <w:left w:type="dxa" w:w="120"/>
+              <w:bottom w:type="dxa" w:w="80"/>
+              <w:right w:type="dxa" w:w="120"/>
+            </w:tcMar>
+          </w:tcPr>
+          <w:p>
+            <w:r>
+              <w:rPr>
+                <w:rFonts w:ascii="Arial" w:cs="Arial" w:eastAsia="Arial" w:hAnsi="Arial"/>
+                <w:sz w:val="20"/>
+                <w:szCs w:val="20"/>
+              </w:rPr>
+              <w:t xml:space="preserve">(per line height)</w:t>
+            </w:r>
+          </w:p>
+        </w:tc>
+        <w:tc>
+          <w:tcPr>
+            <w:tcW w:type="dxa" w:w="4560"/>
+            <w:tcBorders>
+              <w:top w:val="single" w:color="CCCCCC" w:sz="1"/>
+              <w:left w:val="single" w:color="CCCCCC" w:sz="1"/>
+              <w:bottom w:val="single" w:color="CCCCCC" w:sz="1"/>
+              <w:right w:val="single" w:color="CCCCCC" w:sz="1"/>
+            </w:tcBorders>
+            <w:tcMar>
+              <w:top w:type="dxa" w:w="80"/>
+              <w:left w:type="dxa" w:w="120"/>
+              <w:bottom w:type="dxa" w:w="80"/>
+              <w:right w:type="dxa" w:w="120"/>
+            </w:tcMar>
+          </w:tcPr>
+          <w:p>
+            <w:r>
+              <w:rPr>
+                <w:rFonts w:ascii="Arial" w:cs="Arial" w:eastAsia="Arial" w:hAnsi="Arial"/>
+                <w:sz w:val="20"/>
+                <w:szCs w:val="20"/>
+              </w:rPr>
+              <w:t xml:space="preserve">Minimum box height in pixels. Set to one line of text + padding for click-to-create, or the drawn height for drag-to-create.</w:t>
             </w:r>
           </w:p>
         </w:tc>
@@ -7539,7 +7746,7 @@
         <w:pStyle w:val="Heading2"/>
       </w:pPr>
       <w:r>
-        <w:t xml:space="preserve">3.4 Auto-Size Behavior</w:t>
+        <w:t xml:space="preserve">3.4 Auto-Size and Resize Behavior</w:t>
       </w:r>
     </w:p>
     <w:p>
@@ -7551,7 +7758,7 @@
           <w:b/>
           <w:bCs/>
         </w:rPr>
-        <w:t xml:space="preserve">Auto-Height (default):</w:t>
+        <w:t xml:space="preserve">3.4.1 During Text Entry (Edit Mode):</w:t>
       </w:r>
     </w:p>
     <w:p>
@@ -7564,7 +7771,7 @@
         <w:spacing w:after="60"/>
       </w:pPr>
       <w:r>
-        <w:t xml:space="preserve">The text box width remains fixed (set by creation or manual resize).</w:t>
+        <w:t xml:space="preserve">While the text box is in edit mode, both width and height auto-size to fit the text content at all times. All entered text is always fully visible.</w:t>
       </w:r>
     </w:p>
     <w:p>
@@ -7577,7 +7784,7 @@
         <w:spacing w:after="60"/>
       </w:pPr>
       <w:r>
-        <w:t xml:space="preserve">QTextDocument.setTextWidth(box_width - padding_left - padding_right) enables word wrapping within the available width.</w:t>
+        <w:t xml:space="preserve">Word wrapping is disabled during edit mode. Each line extends horizontally as far as the user types. Lines only break on Enter (new paragraph) or pasted newlines.</w:t>
       </w:r>
     </w:p>
     <w:p>
@@ -7590,7 +7797,7 @@
         <w:spacing w:after="60"/>
       </w:pPr>
       <w:r>
-        <w:t xml:space="preserve">After each text edit, the box height is recalculated: height = QTextDocument.size().height() + padding_top + padding_bottom.</w:t>
+        <w:t xml:space="preserve">After each keystroke or paste operation, the box dimensions are recalculated: width = max(all line widths) + padding_left + padding_right; height = QTextDocument.size().height() + padding_top + padding_bottom.</w:t>
       </w:r>
     </w:p>
     <w:p>
@@ -7603,7 +7810,7 @@
         <w:spacing w:after="60"/>
       </w:pPr>
       <w:r>
-        <w:t xml:space="preserve">The minimum height is 1 line of text + padding (approximately 24px for 14pt font).</w:t>
+        <w:t xml:space="preserve">The box dimensions never shrink below the minimum size. For click-to-create, the minimum width is 200px. For drag-to-create, the minimum width and height are the dimensions drawn by the user. The minimum height for click-to-create is 1 line of text + padding.</w:t>
       </w:r>
     </w:p>
     <w:p>
@@ -7616,7 +7823,7 @@
         <w:spacing w:after="60"/>
       </w:pPr>
       <w:r>
-        <w:t xml:space="preserve">When the user manually resizes the height using TransformHandles (Select tool), auto_height is automatically disabled and the box switches to fixed-height mode. A small "Auto" button appears in the Property Panel to re-enable auto_height.</w:t>
+        <w:t xml:space="preserve">Alignment settings from the Tool Options Bar are applied in real time during text entry. The user always sees text positioned (Left, Center, Right, Justify; Top, Middle, Bottom) as it will appear in the final result, consistent with WYSIWYG behavior.</w:t>
       </w:r>
     </w:p>
     <w:p>
@@ -7629,7 +7836,20 @@
         <w:spacing w:after="60"/>
       </w:pPr>
       <w:r>
-        <w:t xml:space="preserve">Auto-height growth anchors at the top edge: the top-left corner stays fixed and the bottom edge moves down.</w:t>
+        <w:t xml:space="preserve">If a text_scale_factor is applied (see Section 3.4.3), auto-sizing and editing operate at the scaled visual size. The cursor, selection highlights, and newly typed text all render at the scaled size to maintain WYSIWYG fidelity.</w:t>
+      </w:r>
+    </w:p>
+    <w:p>
+      <w:pPr>
+        <w:pStyle w:val="ListParagraph"/>
+        <w:numPr>
+          <w:ilvl w:val="0"/>
+          <w:numId w:val="18"/>
+        </w:numPr>
+        <w:spacing w:after="60"/>
+      </w:pPr>
+      <w:r>
+        <w:t xml:space="preserve">Auto-size growth anchors at the top-left corner: the top-left position stays fixed and the right and bottom edges expand outward.</w:t>
       </w:r>
     </w:p>
     <w:p>
@@ -7641,7 +7861,7 @@
           <w:b/>
           <w:bCs/>
         </w:rPr>
-        <w:t xml:space="preserve">Auto-Width:</w:t>
+        <w:t xml:space="preserve">3.4.2 Post-Entry Normal Resize (No Modifier Key):</w:t>
       </w:r>
     </w:p>
     <w:p>
@@ -7654,7 +7874,7 @@
         <w:spacing w:after="60"/>
       </w:pPr>
       <w:r>
-        <w:t xml:space="preserve">When auto_width is True, word wrapping is disabled. Each paragraph is a single line.</w:t>
+        <w:t xml:space="preserve">When the user exits edit mode and selects the text box with the Select tool, dragging any TransformHandle resizes the box freely in both width and height.</w:t>
       </w:r>
     </w:p>
     <w:p>
@@ -7667,7 +7887,7 @@
         <w:spacing w:after="60"/>
       </w:pPr>
       <w:r>
-        <w:t xml:space="preserve">The box width adjusts to fit the longest line: width = max(line widths) + padding_left + padding_right.</w:t>
+        <w:t xml:space="preserve">Text reflows (word wraps) to fit the new width. Line breaks change dynamically as the width changes.</w:t>
       </w:r>
     </w:p>
     <w:p>
@@ -7680,7 +7900,7 @@
         <w:spacing w:after="60"/>
       </w:pPr>
       <w:r>
-        <w:t xml:space="preserve">The minimum width is 20px.</w:t>
+        <w:t xml:space="preserve">If the text box is resized smaller than the text content requires, the text overflows outside the text box boundary but remains fully visible. Under no circumstance is entered text hidden, clipped, or truncated.</w:t>
       </w:r>
     </w:p>
     <w:p>
@@ -7693,7 +7913,7 @@
         <w:spacing w:after="60"/>
       </w:pPr>
       <w:r>
-        <w:t xml:space="preserve">Auto-width is useful for single-line labels and short annotations.</w:t>
+        <w:t xml:space="preserve">If the text box is larger than the text content, the text is positioned within the box according to the alignment settings: horizontal (Left, Center, Right, Justify) and vertical (Top, Middle, Bottom).</w:t>
       </w:r>
     </w:p>
     <w:p>
@@ -7706,7 +7926,7 @@
         <w:spacing w:after="60"/>
       </w:pPr>
       <w:r>
-        <w:t xml:space="preserve">When auto_width is enabled, auto_height is also forced to True (the box grows in both directions to fit content).</w:t>
+        <w:t xml:space="preserve">Minimum resize dimensions: 20px width, 16px height.</w:t>
       </w:r>
     </w:p>
     <w:p>
@@ -7718,7 +7938,7 @@
           <w:b/>
           <w:bCs/>
         </w:rPr>
-        <w:t xml:space="preserve">Fixed Size (both auto_ disabled):</w:t>
+        <w:t xml:space="preserve">3.4.3 Post-Entry Shift+Resize (Scale Mode):</w:t>
       </w:r>
     </w:p>
     <w:p>
@@ -7731,7 +7951,7 @@
         <w:spacing w:after="60"/>
       </w:pPr>
       <w:r>
-        <w:t xml:space="preserve">Both width and height are fixed. Text wraps within the width and clips at the height boundary.</w:t>
+        <w:t xml:space="preserve">When the user holds Shift while dragging a TransformHandle, the text scales proportionally to fit the new box dimensions. The text does not reflow — all existing line breaks are preserved.</w:t>
       </w:r>
     </w:p>
     <w:p>
@@ -7744,7 +7964,136 @@
         <w:spacing w:after="60"/>
       </w:pPr>
       <w:r>
-        <w:t xml:space="preserve">Overflow is indicated based on overflow_mode: Clip (hard clip at boundary), Ellipsis (last visible line ends with "..."), Grow (auto_height is re-enabled).</w:t>
+        <w:t xml:space="preserve">Scaling is implemented via a text_scale_factor property (float, default 1.0) applied at render time. The underlying QTextDocument font sizes are not modified. The QPainter is scaled by text_scale_factor before drawing the text content.</w:t>
+      </w:r>
+    </w:p>
+    <w:p>
+      <w:pPr>
+        <w:pStyle w:val="ListParagraph"/>
+        <w:numPr>
+          <w:ilvl w:val="0"/>
+          <w:numId w:val="20"/>
+        </w:numPr>
+        <w:spacing w:after="60"/>
+      </w:pPr>
+      <w:r>
+        <w:t xml:space="preserve">The scale factor preserves relative size ratios between differently-sized text. For example, 14pt and 24pt text at scale 0.5 render at 7pt and 12pt visual sizes respectively.</w:t>
+      </w:r>
+    </w:p>
+    <w:p>
+      <w:pPr>
+        <w:pStyle w:val="ListParagraph"/>
+        <w:numPr>
+          <w:ilvl w:val="0"/>
+          <w:numId w:val="20"/>
+        </w:numPr>
+        <w:spacing w:after="60"/>
+      </w:pPr>
+      <w:r>
+        <w:t xml:space="preserve">The text_scale_factor allows fractional rendering sizes that cannot be achieved with integer or half-point font sizes alone.</w:t>
+      </w:r>
+    </w:p>
+    <w:p>
+      <w:pPr>
+        <w:pStyle w:val="ListParagraph"/>
+        <w:numPr>
+          <w:ilvl w:val="0"/>
+          <w:numId w:val="20"/>
+        </w:numPr>
+        <w:spacing w:after="60"/>
+      </w:pPr>
+      <w:r>
+        <w:t xml:space="preserve">The scale factor applies at all times, including during subsequent edit mode sessions, ensuring WYSIWYG behavior.</w:t>
+      </w:r>
+    </w:p>
+    <w:p>
+      <w:pPr>
+        <w:pStyle w:val="ListParagraph"/>
+        <w:numPr>
+          <w:ilvl w:val="0"/>
+          <w:numId w:val="20"/>
+        </w:numPr>
+        <w:spacing w:after="60"/>
+      </w:pPr>
+      <w:r>
+        <w:t xml:space="preserve">The text_scale_factor is serialized as a property on the TextItem and persists across save/load.</w:t>
+      </w:r>
+    </w:p>
+    <w:p>
+      <w:pPr>
+        <w:spacing w:after="120"/>
+      </w:pPr>
+      <w:r>
+        <w:rPr>
+          <w:b/>
+          <w:bCs/>
+        </w:rPr>
+        <w:t xml:space="preserve">3.4.4 Scale Factor Reset on Explicit Font Size Selection:</w:t>
+      </w:r>
+    </w:p>
+    <w:p>
+      <w:pPr>
+        <w:pStyle w:val="ListParagraph"/>
+        <w:numPr>
+          <w:ilvl w:val="0"/>
+          <w:numId w:val="18"/>
+        </w:numPr>
+        <w:spacing w:after="60"/>
+      </w:pPr>
+      <w:r>
+        <w:t xml:space="preserve">If the user enters edit mode on a text box that has a text_scale_factor other than 1.0, selects any portion of text, and explicitly chooses a font size from the Tool Options Bar, the following sequence occurs as a single undoable command:</w:t>
+      </w:r>
+    </w:p>
+    <w:p>
+      <w:pPr>
+        <w:pStyle w:val="ListParagraph"/>
+        <w:numPr>
+          <w:ilvl w:val="1"/>
+          <w:numId w:val="18"/>
+        </w:numPr>
+        <w:spacing w:after="60"/>
+      </w:pPr>
+      <w:r>
+        <w:t xml:space="preserve">Bake the current scale factor into all text in the box: every character’s font size is multiplied by the current text_scale_factor (e.g., 14pt at scale 0.5 becomes 7pt).</w:t>
+      </w:r>
+    </w:p>
+    <w:p>
+      <w:pPr>
+        <w:pStyle w:val="ListParagraph"/>
+        <w:numPr>
+          <w:ilvl w:val="1"/>
+          <w:numId w:val="18"/>
+        </w:numPr>
+        <w:spacing w:after="60"/>
+      </w:pPr>
+      <w:r>
+        <w:t xml:space="preserve">Reset text_scale_factor to 1.0.</w:t>
+      </w:r>
+    </w:p>
+    <w:p>
+      <w:pPr>
+        <w:pStyle w:val="ListParagraph"/>
+        <w:numPr>
+          <w:ilvl w:val="1"/>
+          <w:numId w:val="18"/>
+        </w:numPr>
+        <w:spacing w:after="60"/>
+      </w:pPr>
+      <w:r>
+        <w:t xml:space="preserve">Apply the user’s chosen font size to the selected portion of text.</w:t>
+      </w:r>
+    </w:p>
+    <w:p>
+      <w:pPr>
+        <w:pStyle w:val="ListParagraph"/>
+        <w:numPr>
+          <w:ilvl w:val="0"/>
+          <w:numId w:val="18"/>
+        </w:numPr>
+        <w:spacing w:after="60"/>
+      </w:pPr>
+      <w:r>
+        <w:t xml:space="preserve">After this operation, all text displays at the same visual sizes as before the reset, except the selected portion which displays at the explicitly chosen size. No visual discontinuity occurs for the unselected text.</w:t>
       </w:r>
     </w:p>
     <w:p>
@@ -8003,7 +8352,7 @@
         <w:spacing w:after="60"/>
       </w:pPr>
       <w:r>
-        <w:t xml:space="preserve">Dragging corner TransformHandles resizes the box. If auto_height is enabled, only the width changes (height adjusts automatically). If auto_height is disabled, both width and height change freely.</w:t>
+        <w:t xml:space="preserve">Resize behavior follows the rules defined in Section 3.4. Without modifier keys: the box resizes freely, text reflows to the new width, and text that exceeds the box boundary overflows visibly and is never hidden. See Section 3.4.2.</w:t>
       </w:r>
     </w:p>
     <w:p>
@@ -8016,7 +8365,7 @@
         <w:spacing w:after="60"/>
       </w:pPr>
       <w:r>
-        <w:t xml:space="preserve">Dragging the left or right edge midpoint handle changes the width only. Text re-wraps to the new width.</w:t>
+        <w:t xml:space="preserve">With Shift held: the text scales proportionally to fit the new box dimensions without reflowing. The text_scale_factor property is updated. See Section 3.4.3.</w:t>
       </w:r>
     </w:p>
     <w:p>
@@ -8029,7 +8378,7 @@
         <w:spacing w:after="60"/>
       </w:pPr>
       <w:r>
-        <w:t xml:space="preserve">Dragging the top or bottom edge midpoint handle changes the height. If auto_height was enabled, it is disabled. The text clips or has empty space depending on the new height.</w:t>
+        <w:t xml:space="preserve">Dragging corner TransformHandles resizes both width and height simultaneously.</w:t>
       </w:r>
     </w:p>
     <w:p>
@@ -8042,7 +8391,7 @@
         <w:spacing w:after="60"/>
       </w:pPr>
       <w:r>
-        <w:t xml:space="preserve">Shift during resize: constrains to the original aspect ratio.</w:t>
+        <w:t xml:space="preserve">Dragging edge midpoint handles resizes only the corresponding dimension (left/right midpoints change width only; top/bottom midpoints change height only).</w:t>
       </w:r>
     </w:p>
     <w:p>
@@ -8148,7 +8497,7 @@
         <w:spacing w:after="60"/>
       </w:pPr>
       <w:r>
-        <w:t xml:space="preserve">Set the QPainter clip to the text area (shape inset by padding).</w:t>
+        <w:t xml:space="preserve">If in edit mode, set the QPainter clip to the text area (shape inset by padding). If not in edit mode, do not clip — text that overflows the boundary renders visibly outside the box.</w:t>
       </w:r>
     </w:p>
     <w:p>
@@ -8174,20 +8523,20 @@
         <w:spacing w:after="60"/>
       </w:pPr>
       <w:r>
+        <w:t xml:space="preserve">If text_scale_factor ≠ 1.0: apply QPainter.scale(text_scale_factor) before drawing text content. Adjust the text area rect accordingly to account for the scale transform.</w:t>
+      </w:r>
+    </w:p>
+    <w:p>
+      <w:pPr>
+        <w:pStyle w:val="ListParagraph"/>
+        <w:numPr>
+          <w:ilvl w:val="0"/>
+          <w:numId w:val="23"/>
+        </w:numPr>
+        <w:spacing w:after="60"/>
+      </w:pPr>
+      <w:r>
         <w:t xml:space="preserve">Call QTextDocument.drawContents(painter, text_area_rect) with the appropriate vertical offset.</w:t>
-      </w:r>
-    </w:p>
-    <w:p>
-      <w:pPr>
-        <w:pStyle w:val="ListParagraph"/>
-        <w:numPr>
-          <w:ilvl w:val="0"/>
-          <w:numId w:val="23"/>
-        </w:numPr>
-        <w:spacing w:after="60"/>
-      </w:pPr>
-      <w:r>
-        <w:t xml:space="preserve">If text overflows and overflow_mode is Ellipsis: render a gradient fade or "..." at the clip boundary.</w:t>
       </w:r>
     </w:p>
     <w:p>
@@ -12804,7 +13153,7 @@
         <w:spacing w:after="60"/>
       </w:pPr>
       <w:r>
-        <w:t xml:space="preserve">Overflow indicator if text is clipped.</w:t>
+        <w:t xml:space="preserve">If text exceeds the bubble text area, the text overflows outside the bubble boundary but remains fully visible. Text is never clipped or hidden.</w:t>
       </w:r>
     </w:p>
     <w:p>
@@ -14579,7 +14928,7 @@
                 <w:sz w:val="20"/>
                 <w:szCs w:val="20"/>
               </w:rPr>
-              <w:t xml:space="preserve">overflow_mode</w:t>
+              <w:t xml:space="preserve">text_scale_factor</w:t>
             </w:r>
           </w:p>
         </w:tc>
@@ -14606,7 +14955,7 @@
                 <w:sz w:val="20"/>
                 <w:szCs w:val="20"/>
               </w:rPr>
-              <w:t xml:space="preserve">str</w:t>
+              <w:t xml:space="preserve">float</w:t>
             </w:r>
           </w:p>
         </w:tc>
@@ -14633,7 +14982,173 @@
                 <w:sz w:val="20"/>
                 <w:szCs w:val="20"/>
               </w:rPr>
-              <w:t xml:space="preserve">"overflow_mode": "grow" | "clip" | "ellipsis"</w:t>
+              <w:t xml:space="preserve">"text_scale_factor": float</w:t>
+            </w:r>
+          </w:p>
+        </w:tc>
+      </w:tr>
+      <w:tr>
+        <w:tc>
+          <w:tcPr>
+            <w:tcW w:type="dxa" w:w="1800"/>
+            <w:tcBorders>
+              <w:top w:val="single" w:color="CCCCCC" w:sz="1"/>
+              <w:left w:val="single" w:color="CCCCCC" w:sz="1"/>
+              <w:bottom w:val="single" w:color="CCCCCC" w:sz="1"/>
+              <w:right w:val="single" w:color="CCCCCC" w:sz="1"/>
+            </w:tcBorders>
+            <w:tcMar>
+              <w:top w:type="dxa" w:w="80"/>
+              <w:left w:type="dxa" w:w="120"/>
+              <w:bottom w:type="dxa" w:w="80"/>
+              <w:right w:type="dxa" w:w="120"/>
+            </w:tcMar>
+          </w:tcPr>
+          <w:p>
+            <w:r>
+              <w:rPr>
+                <w:rFonts w:ascii="Arial" w:cs="Arial" w:eastAsia="Arial" w:hAnsi="Arial"/>
+                <w:sz w:val="20"/>
+                <w:szCs w:val="20"/>
+              </w:rPr>
+              <w:t xml:space="preserve">min_width</w:t>
+            </w:r>
+          </w:p>
+        </w:tc>
+        <w:tc>
+          <w:tcPr>
+            <w:tcW w:type="dxa" w:w="1400"/>
+            <w:tcBorders>
+              <w:top w:val="single" w:color="CCCCCC" w:sz="1"/>
+              <w:left w:val="single" w:color="CCCCCC" w:sz="1"/>
+              <w:bottom w:val="single" w:color="CCCCCC" w:sz="1"/>
+              <w:right w:val="single" w:color="CCCCCC" w:sz="1"/>
+            </w:tcBorders>
+            <w:tcMar>
+              <w:top w:type="dxa" w:w="80"/>
+              <w:left w:type="dxa" w:w="120"/>
+              <w:bottom w:type="dxa" w:w="80"/>
+              <w:right w:type="dxa" w:w="120"/>
+            </w:tcMar>
+          </w:tcPr>
+          <w:p>
+            <w:r>
+              <w:rPr>
+                <w:rFonts w:ascii="Arial" w:cs="Arial" w:eastAsia="Arial" w:hAnsi="Arial"/>
+                <w:sz w:val="20"/>
+                <w:szCs w:val="20"/>
+              </w:rPr>
+              <w:t xml:space="preserve">float</w:t>
+            </w:r>
+          </w:p>
+        </w:tc>
+        <w:tc>
+          <w:tcPr>
+            <w:tcW w:type="dxa" w:w="6160"/>
+            <w:tcBorders>
+              <w:top w:val="single" w:color="CCCCCC" w:sz="1"/>
+              <w:left w:val="single" w:color="CCCCCC" w:sz="1"/>
+              <w:bottom w:val="single" w:color="CCCCCC" w:sz="1"/>
+              <w:right w:val="single" w:color="CCCCCC" w:sz="1"/>
+            </w:tcBorders>
+            <w:tcMar>
+              <w:top w:type="dxa" w:w="80"/>
+              <w:left w:type="dxa" w:w="120"/>
+              <w:bottom w:type="dxa" w:w="80"/>
+              <w:right w:type="dxa" w:w="120"/>
+            </w:tcMar>
+          </w:tcPr>
+          <w:p>
+            <w:r>
+              <w:rPr>
+                <w:rFonts w:ascii="Arial" w:cs="Arial" w:eastAsia="Arial" w:hAnsi="Arial"/>
+                <w:sz w:val="20"/>
+                <w:szCs w:val="20"/>
+              </w:rPr>
+              <w:t xml:space="preserve">"min_width": float</w:t>
+            </w:r>
+          </w:p>
+        </w:tc>
+      </w:tr>
+      <w:tr>
+        <w:tc>
+          <w:tcPr>
+            <w:tcW w:type="dxa" w:w="1800"/>
+            <w:tcBorders>
+              <w:top w:val="single" w:color="CCCCCC" w:sz="1"/>
+              <w:left w:val="single" w:color="CCCCCC" w:sz="1"/>
+              <w:bottom w:val="single" w:color="CCCCCC" w:sz="1"/>
+              <w:right w:val="single" w:color="CCCCCC" w:sz="1"/>
+            </w:tcBorders>
+            <w:tcMar>
+              <w:top w:type="dxa" w:w="80"/>
+              <w:left w:type="dxa" w:w="120"/>
+              <w:bottom w:type="dxa" w:w="80"/>
+              <w:right w:type="dxa" w:w="120"/>
+            </w:tcMar>
+          </w:tcPr>
+          <w:p>
+            <w:r>
+              <w:rPr>
+                <w:rFonts w:ascii="Arial" w:cs="Arial" w:eastAsia="Arial" w:hAnsi="Arial"/>
+                <w:sz w:val="20"/>
+                <w:szCs w:val="20"/>
+              </w:rPr>
+              <w:t xml:space="preserve">min_height</w:t>
+            </w:r>
+          </w:p>
+        </w:tc>
+        <w:tc>
+          <w:tcPr>
+            <w:tcW w:type="dxa" w:w="1400"/>
+            <w:tcBorders>
+              <w:top w:val="single" w:color="CCCCCC" w:sz="1"/>
+              <w:left w:val="single" w:color="CCCCCC" w:sz="1"/>
+              <w:bottom w:val="single" w:color="CCCCCC" w:sz="1"/>
+              <w:right w:val="single" w:color="CCCCCC" w:sz="1"/>
+            </w:tcBorders>
+            <w:tcMar>
+              <w:top w:type="dxa" w:w="80"/>
+              <w:left w:type="dxa" w:w="120"/>
+              <w:bottom w:type="dxa" w:w="80"/>
+              <w:right w:type="dxa" w:w="120"/>
+            </w:tcMar>
+          </w:tcPr>
+          <w:p>
+            <w:r>
+              <w:rPr>
+                <w:rFonts w:ascii="Arial" w:cs="Arial" w:eastAsia="Arial" w:hAnsi="Arial"/>
+                <w:sz w:val="20"/>
+                <w:szCs w:val="20"/>
+              </w:rPr>
+              <w:t xml:space="preserve">float</w:t>
+            </w:r>
+          </w:p>
+        </w:tc>
+        <w:tc>
+          <w:tcPr>
+            <w:tcW w:type="dxa" w:w="6160"/>
+            <w:tcBorders>
+              <w:top w:val="single" w:color="CCCCCC" w:sz="1"/>
+              <w:left w:val="single" w:color="CCCCCC" w:sz="1"/>
+              <w:bottom w:val="single" w:color="CCCCCC" w:sz="1"/>
+              <w:right w:val="single" w:color="CCCCCC" w:sz="1"/>
+            </w:tcBorders>
+            <w:tcMar>
+              <w:top w:type="dxa" w:w="80"/>
+              <w:left w:type="dxa" w:w="120"/>
+              <w:bottom w:type="dxa" w:w="80"/>
+              <w:right w:type="dxa" w:w="120"/>
+            </w:tcMar>
+          </w:tcPr>
+          <w:p>
+            <w:r>
+              <w:rPr>
+                <w:rFonts w:ascii="Arial" w:cs="Arial" w:eastAsia="Arial" w:hAnsi="Arial"/>
+                <w:sz w:val="20"/>
+                <w:szCs w:val="20"/>
+              </w:rPr>
+              <w:t xml:space="preserve">"min_height": float</w:t>
             </w:r>
           </w:p>
         </w:tc>
@@ -19212,7 +19727,7 @@
           <w:sz w:val="18"/>
           <w:szCs w:val="18"/>
         </w:rPr>
-        <w:t xml:space="preserve">  "auto_width": false,</w:t>
+        <w:t xml:space="preserve">  "auto_width": true,</w:t>
       </w:r>
     </w:p>
     <w:p>
@@ -19329,7 +19844,20 @@
           <w:sz w:val="18"/>
           <w:szCs w:val="18"/>
         </w:rPr>
-        <w:t xml:space="preserve">  "overflow_mode": "grow",</w:t>
+        <w:t xml:space="preserve">  "text_scale_factor": 1.0,</w:t>
+      </w:r>
+    </w:p>
+    <w:p>
+      <w:pPr>
+        <w:spacing w:after="120"/>
+      </w:pPr>
+      <w:r>
+        <w:rPr>
+          <w:rFonts w:ascii="Courier New" w:cs="Courier New" w:eastAsia="Courier New" w:hAnsi="Courier New"/>
+          <w:sz w:val="18"/>
+          <w:szCs w:val="18"/>
+        </w:rPr>
+        <w:t xml:space="preserve">  "min_width": 200, "min_height": 24,</w:t>
       </w:r>
     </w:p>
     <w:p>
@@ -19587,7 +20115,7 @@
         <w:spacing w:after="60"/>
       </w:pPr>
       <w:r>
-        <w:t xml:space="preserve">Click-to-create produces a 200px-wide text box at the click position and enters edit mode.</w:t>
+        <w:t xml:space="preserve">Click-to-create produces a text box with a 200px minimum width that auto-sizes to fit text content and enters edit mode.</w:t>
       </w:r>
     </w:p>
     <w:p>
@@ -19626,7 +20154,7 @@
         <w:spacing w:after="60"/>
       </w:pPr>
       <w:r>
-        <w:t xml:space="preserve">Auto-height correctly grows the box to fit content. The top-left corner remains anchored.</w:t>
+        <w:t xml:space="preserve">During edit mode, the box auto-sizes in both width and height to fit all text content. The top-left corner remains anchored.</w:t>
       </w:r>
     </w:p>
     <w:p>
@@ -19639,7 +20167,7 @@
         <w:spacing w:after="60"/>
       </w:pPr>
       <w:r>
-        <w:t xml:space="preserve">Auto-width correctly grows the box to fit the longest line when enabled.</w:t>
+        <w:t xml:space="preserve">During edit mode, word wrapping is disabled. Lines only break on Enter or pasted newlines.</w:t>
       </w:r>
     </w:p>
     <w:p>
@@ -19652,7 +20180,7 @@
         <w:spacing w:after="60"/>
       </w:pPr>
       <w:r>
-        <w:t xml:space="preserve">Manual resize via TransformHandles correctly disables auto-height.</w:t>
+        <w:t xml:space="preserve">Normal resize (no modifier) reflows text to the new width. Text that exceeds the box boundary overflows visibly and is never hidden.</w:t>
       </w:r>
     </w:p>
     <w:p>
@@ -19691,7 +20219,7 @@
         <w:spacing w:after="60"/>
       </w:pPr>
       <w:r>
-        <w:t xml:space="preserve">Overflow modes work correctly: Grow expands the box, Clip clips at the boundary, Ellipsis shows "...".</w:t>
+        <w:t xml:space="preserve">Shift+resize scales text proportionally via text_scale_factor without reflowing. Relative font size ratios are preserved.</w:t>
       </w:r>
     </w:p>
     <w:p>
@@ -19718,6 +20246,45 @@
       </w:pPr>
       <w:r>
         <w:t xml:space="preserve">Hit testing respects visibility: transparent/borderless text boxes are only selectable by clicking on the text content.</w:t>
+      </w:r>
+    </w:p>
+    <w:p>
+      <w:pPr>
+        <w:pStyle w:val="ListParagraph"/>
+        <w:numPr>
+          <w:ilvl w:val="0"/>
+          <w:numId w:val="42"/>
+        </w:numPr>
+        <w:spacing w:after="60"/>
+      </w:pPr>
+      <w:r>
+        <w:t xml:space="preserve">Selecting a font size on scaled text correctly bakes the scale factor into all character font sizes, resets text_scale_factor to 1.0, and applies the chosen size to the selection.</w:t>
+      </w:r>
+    </w:p>
+    <w:p>
+      <w:pPr>
+        <w:pStyle w:val="ListParagraph"/>
+        <w:numPr>
+          <w:ilvl w:val="0"/>
+          <w:numId w:val="42"/>
+        </w:numPr>
+        <w:spacing w:after="60"/>
+      </w:pPr>
+      <w:r>
+        <w:t xml:space="preserve">Drag-to-create drawn dimensions are preserved as minimum width and height that auto-sizing never shrinks below.</w:t>
+      </w:r>
+    </w:p>
+    <w:p>
+      <w:pPr>
+        <w:pStyle w:val="ListParagraph"/>
+        <w:numPr>
+          <w:ilvl w:val="0"/>
+          <w:numId w:val="42"/>
+        </w:numPr>
+        <w:spacing w:after="60"/>
+      </w:pPr>
+      <w:r>
+        <w:t xml:space="preserve">Alignment settings (horizontal and vertical) are applied in real time during text entry, maintaining WYSIWYG fidelity.</w:t>
       </w:r>
     </w:p>
     <w:p>
@@ -20124,6 +20691,122 @@
       </w:pPr>
       <w:r>
         <w:t xml:space="preserve">Changelog</w:t>
+      </w:r>
+    </w:p>
+    <w:p>
+      <w:pPr>
+        <w:spacing w:after="120"/>
+      </w:pPr>
+      <w:r>
+        <w:rPr>
+          <w:b/>
+          <w:bCs/>
+        </w:rPr>
+        <w:t xml:space="preserve">Version 1.3 (March 2026)</w:t>
+      </w:r>
+    </w:p>
+    <w:p>
+      <w:pPr>
+        <w:pStyle w:val="ListParagraph"/>
+        <w:numPr>
+          <w:ilvl w:val="0"/>
+          <w:numId w:val="21"/>
+        </w:numPr>
+        <w:spacing w:after="60"/>
+      </w:pPr>
+      <w:r>
+        <w:t xml:space="preserve">Replaced Section 3.4 (Auto-Size Behavior) with comprehensive Auto-Size and Resize Behavior specification covering three modes: auto-sizing during text entry (edit mode), post-entry normal resize with text reflow, and post-entry Shift+resize with proportional text scaling.</w:t>
+      </w:r>
+    </w:p>
+    <w:p>
+      <w:pPr>
+        <w:pStyle w:val="ListParagraph"/>
+        <w:numPr>
+          <w:ilvl w:val="0"/>
+          <w:numId w:val="21"/>
+        </w:numPr>
+        <w:spacing w:after="60"/>
+      </w:pPr>
+      <w:r>
+        <w:t xml:space="preserve">Added text_scale_factor, min_width, and min_height properties to TextItem. Removed overflow_mode property.</w:t>
+      </w:r>
+    </w:p>
+    <w:p>
+      <w:pPr>
+        <w:pStyle w:val="ListParagraph"/>
+        <w:numPr>
+          <w:ilvl w:val="0"/>
+          <w:numId w:val="21"/>
+        </w:numPr>
+        <w:spacing w:after="60"/>
+      </w:pPr>
+      <w:r>
+        <w:t xml:space="preserve">Changed auto_width default from False to True. Text boxes now auto-size in both dimensions during edit mode.</w:t>
+      </w:r>
+    </w:p>
+    <w:p>
+      <w:pPr>
+        <w:pStyle w:val="ListParagraph"/>
+        <w:numPr>
+          <w:ilvl w:val="0"/>
+          <w:numId w:val="21"/>
+        </w:numPr>
+        <w:spacing w:after="60"/>
+      </w:pPr>
+      <w:r>
+        <w:t xml:space="preserve">Eliminated all text clipping behavior. Text that overflows a box or callout bubble boundary now renders visibly outside the boundary and is never hidden.</w:t>
+      </w:r>
+    </w:p>
+    <w:p>
+      <w:pPr>
+        <w:pStyle w:val="ListParagraph"/>
+        <w:numPr>
+          <w:ilvl w:val="0"/>
+          <w:numId w:val="21"/>
+        </w:numPr>
+        <w:spacing w:after="60"/>
+      </w:pPr>
+      <w:r>
+        <w:t xml:space="preserve">Added scale factor reset behavior: selecting an explicit font size bakes the current scale into all character sizes, resets text_scale_factor to 1.0, then applies the chosen size to the selection.</w:t>
+      </w:r>
+    </w:p>
+    <w:p>
+      <w:pPr>
+        <w:pStyle w:val="ListParagraph"/>
+        <w:numPr>
+          <w:ilvl w:val="0"/>
+          <w:numId w:val="21"/>
+        </w:numPr>
+        <w:spacing w:after="60"/>
+      </w:pPr>
+      <w:r>
+        <w:t xml:space="preserve">Added requirement that alignment settings are applied in real time during text entry for WYSIWYG fidelity.</w:t>
+      </w:r>
+    </w:p>
+    <w:p>
+      <w:pPr>
+        <w:pStyle w:val="ListParagraph"/>
+        <w:numPr>
+          <w:ilvl w:val="0"/>
+          <w:numId w:val="21"/>
+        </w:numPr>
+        <w:spacing w:after="60"/>
+      </w:pPr>
+      <w:r>
+        <w:t xml:space="preserve">Updated rendering pipelines (Sections 2.3, 3.7, 4.8) to remove clipping and overflow indicators, add text_scale_factor rendering step.</w:t>
+      </w:r>
+    </w:p>
+    <w:p>
+      <w:pPr>
+        <w:pStyle w:val="ListParagraph"/>
+        <w:numPr>
+          <w:ilvl w:val="0"/>
+          <w:numId w:val="21"/>
+        </w:numPr>
+        <w:spacing w:after="60"/>
+      </w:pPr>
+      <w:r>
+        <w:t xml:space="preserve">Updated creation workflows (Section 3.2), data models (Section 5.1), serialization (Section 7.2), and acceptance criteria (Section 8.2) for consistency.</w:t>
       </w:r>
     </w:p>
     <w:p>

</xml_diff>